<commit_message>
FOVI2026: retira a C. Díaz, M. Macaya y UCM; red de cinco instituciones
Co-Authored-By: Claude Sonnet 5.5 <noreply@anthropic.com>
Claude-Session: https://claude.ai/code/session_01P4g3Yf3jcPuX77QSmk15pC
</commit_message>
<xml_diff>
--- a/fovi2026/final/FOVI2026_Formulario_postulacion_INTEEGRA_FINAL.docx
+++ b/fovi2026/final/FOVI2026_Formulario_postulacion_INTEEGRA_FINAL.docx
@@ -2748,8 +2748,9 @@
                 <w:rFonts w:ascii="Verdana" w:hAnsi="Verdana" w:cs="Verdana" w:eastAsia="Verdana"/>
                 <w:b w:val="0"/>
                 <w:sz w:val="20"/>
-              </w:rPr>
-              <w:t>Universidad Católica del Maule</w:t>
+                <w:highlight w:val="yellow"/>
+              </w:rPr>
+              <w:t>[POR CONFIRMAR: institución nacional asociada de región distinta a la RM]</w:t>
             </w:r>
           </w:p>
         </w:tc>
@@ -6118,7 +6119,6 @@
                 <w:b w:val="0"/>
                 <w:sz w:val="20"/>
               </w:rPr>
-              <w:t>Marlenne Macaya</w:t>
             </w:r>
           </w:p>
         </w:tc>
@@ -6151,7 +6151,6 @@
                 <w:b w:val="0"/>
                 <w:sz w:val="20"/>
               </w:rPr>
-              <w:t>Doctora en Enfermería</w:t>
             </w:r>
           </w:p>
         </w:tc>
@@ -6184,7 +6183,6 @@
                 <w:b w:val="0"/>
                 <w:sz w:val="20"/>
               </w:rPr>
-              <w:t>Enfermería; salud pública y determinantes sociales de la salud</w:t>
             </w:r>
           </w:p>
         </w:tc>
@@ -6217,7 +6215,6 @@
                 <w:b w:val="0"/>
                 <w:sz w:val="20"/>
               </w:rPr>
-              <w:t>Universidad Católica del Maule</w:t>
             </w:r>
           </w:p>
         </w:tc>
@@ -6251,7 +6248,6 @@
                 <w:sz w:val="20"/>
                 <w:highlight w:val="yellow"/>
               </w:rPr>
-              <w:t>[COMPLETAR link]</w:t>
             </w:r>
           </w:p>
         </w:tc>
@@ -6285,7 +6281,6 @@
                 <w:b w:val="0"/>
                 <w:sz w:val="20"/>
               </w:rPr>
-              <w:t>Cristian Díaz Castro</w:t>
             </w:r>
           </w:p>
         </w:tc>
@@ -6318,7 +6313,6 @@
                 <w:b w:val="0"/>
                 <w:sz w:val="20"/>
               </w:rPr>
-              <w:t>Magíster (Master 2, Estudios Europeos e Internacionales, Université Sorbonne Nouvelle)</w:t>
             </w:r>
           </w:p>
         </w:tc>
@@ -6351,7 +6345,6 @@
                 <w:b w:val="0"/>
                 <w:sz w:val="20"/>
               </w:rPr>
-              <w:t>Cooperación internacional y gestión de proyectos internacionales</w:t>
             </w:r>
           </w:p>
         </w:tc>
@@ -6384,7 +6377,6 @@
                 <w:b w:val="0"/>
                 <w:sz w:val="20"/>
               </w:rPr>
-              <w:t>Universidad de Santiago de Chile</w:t>
             </w:r>
           </w:p>
         </w:tc>
@@ -6418,7 +6410,6 @@
                 <w:sz w:val="20"/>
                 <w:highlight w:val="yellow"/>
               </w:rPr>
-              <w:t>[COMPLETAR link]</w:t>
             </w:r>
           </w:p>
         </w:tc>
@@ -10751,7 +10742,16 @@
                 <w:b w:val="0"/>
                 <w:sz w:val="20"/>
               </w:rPr>
-              <w:t>Se declara una red preexistente, con una institución nacional nueva (la Universidad Católica del Maule).</w:t>
+              <w:t xml:space="preserve">Se declara una red preexistente. </w:t>
+            </w:r>
+            <w:r>
+              <w:rPr>
+                <w:rFonts w:ascii="Verdana" w:hAnsi="Verdana" w:cs="Verdana" w:eastAsia="Verdana"/>
+                <w:b w:val="0"/>
+                <w:sz w:val="20"/>
+                <w:highlight w:val="yellow"/>
+              </w:rPr>
+              <w:t>[POR CONFIRMAR: institución nacional asociada de región distinta a la RM]</w:t>
             </w:r>
           </w:p>
           <w:p>
@@ -10812,19 +10812,6 @@
             <w:pPr>
               <w:spacing w:line="240" w:lineRule="auto" w:after="60"/>
             </w:pPr>
-          </w:p>
-          <w:p>
-            <w:pPr>
-              <w:spacing w:line="240" w:lineRule="auto" w:after="60"/>
-            </w:pPr>
-            <w:r>
-              <w:rPr>
-                <w:rFonts w:ascii="Verdana" w:hAnsi="Verdana" w:cs="Verdana" w:eastAsia="Verdana"/>
-                <w:b w:val="0"/>
-                <w:sz w:val="20"/>
-              </w:rPr>
-              <w:t>La Universidad Católica del Maule se incorpora por su Magíster en Salud Pública y su trabajo en determinantes sociales de la salud, a través de la Dra. Marlenne Macaya. Su inclusión responde al objetivo de ANID de articular instituciones de distintas regiones y le da a la red una dimensión territorial real: el Maule es un espacio rural y de ciudades intermedias, distinto del contexto metropolitano de Santiago.</w:t>
-            </w:r>
           </w:p>
           <w:p>
             <w:pPr>
@@ -11700,7 +11687,7 @@
                 <w:b w:val="0"/>
                 <w:sz w:val="20"/>
               </w:rPr>
-              <w:t>Universidade Politécnica de Coimbra (Portugal). Creada en 1979 como Instituto Politécnico de Coimbra, es una de las diez mayores instituciones de educación superior públicas de Portugal, con seis unidades de enseñanza y una unidad de investigación (i2A, Instituto de Investigação Aplicada). Su Instituto Superior de Engenharia (ISEC) y el núcleo SUScita aportan ingeniería aplicada, análisis geoespacial y trayectoria en cooperación técnica con los países africanos de lengua portuguesa. El investigador João Paulo Martins Gouveia coordinó la participación de la UPCoimbra en INTEEGRA-Saúde. Aporta a Chile capacidad en SIG y geografía de la salud (la base teórica de Santana, 2014, es de la Universidad de Coimbra), útil para el estudio comparado y para formar a estudiantes y tesistas chilenos. Complementa a USACH en el análisis territorial y a la UCM en la lectura de determinantes sociales.</w:t>
+              <w:t>Universidade Politécnica de Coimbra (Portugal). Creada en 1979 como Instituto Politécnico de Coimbra, es una de las diez mayores instituciones de educación superior públicas de Portugal, con seis unidades de enseñanza y una unidad de investigación (i2A, Instituto de Investigação Aplicada). Su Instituto Superior de Engenharia (ISEC) y el núcleo SUScita aportan ingeniería aplicada, análisis geoespacial y trayectoria en cooperación técnica con los países africanos de lengua portuguesa. El investigador João Paulo Martins Gouveia coordinó la participación de la UPCoimbra en INTEEGRA-Saúde. Aporta a Chile capacidad en SIG y geografía de la salud (la base teórica de Santana, 2014, es de la Universidad de Coimbra), útil para el estudio comparado y para formar a estudiantes y tesistas chilenos. Complementa a USACH en el análisis territorial.</w:t>
             </w:r>
           </w:p>
           <w:p>
@@ -13161,7 +13148,6 @@
                 <w:b w:val="0"/>
                 <w:sz w:val="20"/>
               </w:rPr>
-              <w:t>Marlenne Macaya / Universidad Católica del Maule</w:t>
             </w:r>
           </w:p>
         </w:tc>
@@ -13197,7 +13183,6 @@
                 <w:b w:val="0"/>
                 <w:sz w:val="20"/>
               </w:rPr>
-              <w:t>Investigadora Asociada</w:t>
             </w:r>
           </w:p>
         </w:tc>
@@ -13233,7 +13218,6 @@
                 <w:b w:val="0"/>
                 <w:sz w:val="20"/>
               </w:rPr>
-              <w:t>8</w:t>
             </w:r>
           </w:p>
         </w:tc>
@@ -13269,7 +13253,6 @@
                 <w:b w:val="0"/>
                 <w:sz w:val="20"/>
               </w:rPr>
-              <w:t>Salud pública y determinantes sociales; lidera el trabajo en su región y la jornada territorial.</w:t>
             </w:r>
           </w:p>
         </w:tc>
@@ -13310,7 +13293,6 @@
                 <w:b w:val="0"/>
                 <w:sz w:val="20"/>
               </w:rPr>
-              <w:t>Cristian Díaz Castro / Universidad de Santiago de Chile</w:t>
             </w:r>
           </w:p>
         </w:tc>
@@ -13346,7 +13328,6 @@
                 <w:b w:val="0"/>
                 <w:sz w:val="20"/>
               </w:rPr>
-              <w:t>Investigador Asociado</w:t>
             </w:r>
           </w:p>
         </w:tc>
@@ -13382,7 +13363,6 @@
                 <w:b w:val="0"/>
                 <w:sz w:val="20"/>
               </w:rPr>
-              <w:t>20</w:t>
             </w:r>
           </w:p>
         </w:tc>
@@ -13418,7 +13398,6 @@
                 <w:b w:val="0"/>
                 <w:sz w:val="20"/>
               </w:rPr>
-              <w:t>Coordinación de la red, gestión de convenios y de la plataforma de seguimiento; redacción del policy brief.</w:t>
             </w:r>
           </w:p>
         </w:tc>
@@ -13459,7 +13438,7 @@
                 <w:b w:val="0"/>
                 <w:sz w:val="20"/>
               </w:rPr>
-              <w:t>Estudiantes y tesistas de USACH y UCM (por definir)</w:t>
+              <w:t>Estudiantes y tesistas de USACH (por definir)</w:t>
             </w:r>
           </w:p>
         </w:tc>
@@ -13905,7 +13884,7 @@
                 <w:b w:val="0"/>
                 <w:sz w:val="20"/>
               </w:rPr>
-              <w:t>El equipo reúne sustentabilidad ambiental y análisis territorial, enfermería y APS, salud pública y determinantes sociales, y gestión de cooperación internacional.</w:t>
+              <w:t>El equipo reúne sustentabilidad ambiental y análisis territorial, enfermería y APS, y gestión de cooperación internacional.</w:t>
             </w:r>
           </w:p>
           <w:p>
@@ -13958,53 +13937,18 @@
             <w:pPr>
               <w:spacing w:line="240" w:lineRule="auto" w:after="60"/>
             </w:pPr>
-            <w:r>
-              <w:rPr>
-                <w:rFonts w:ascii="Verdana" w:hAnsi="Verdana" w:cs="Verdana" w:eastAsia="Verdana"/>
-                <w:b w:val="0"/>
-                <w:sz w:val="20"/>
-              </w:rPr>
-              <w:t xml:space="preserve">Dra. Marlenne Macaya (UCM): salud pública y determinantes sociales de la salud; coordinadora del Magíster en Salud Pública. </w:t>
-            </w:r>
-            <w:r>
-              <w:rPr>
-                <w:rFonts w:ascii="Verdana" w:hAnsi="Verdana" w:cs="Verdana" w:eastAsia="Verdana"/>
-                <w:b w:val="0"/>
-                <w:sz w:val="20"/>
-                <w:highlight w:val="yellow"/>
-              </w:rPr>
-              <w:t>[AÑADIR: 2 o 3 proyectos o publicaciones.]</w:t>
-            </w:r>
-          </w:p>
-          <w:p>
-            <w:pPr>
-              <w:spacing w:line="240" w:lineRule="auto" w:after="60"/>
-            </w:pPr>
-            <w:r>
-              <w:rPr>
-                <w:rFonts w:ascii="Verdana" w:hAnsi="Verdana" w:cs="Verdana" w:eastAsia="Verdana"/>
-                <w:b w:val="0"/>
-                <w:sz w:val="20"/>
-              </w:rPr>
-              <w:t>Cristian Díaz Castro: gestión de cooperación internacional, con experiencia en Chad, Kenia y en proyectos de salud global en el postgrado de Salud Pública de la PUC.</w:t>
-            </w:r>
-          </w:p>
-          <w:p>
-            <w:pPr>
-              <w:spacing w:line="240" w:lineRule="auto" w:after="60"/>
-            </w:pPr>
-          </w:p>
-          <w:p>
-            <w:pPr>
-              <w:spacing w:line="240" w:lineRule="auto" w:after="60"/>
-            </w:pPr>
-            <w:r>
-              <w:rPr>
-                <w:rFonts w:ascii="Verdana" w:hAnsi="Verdana" w:cs="Verdana" w:eastAsia="Verdana"/>
-                <w:b w:val="0"/>
-                <w:sz w:val="20"/>
-              </w:rPr>
-              <w:t>Articulación. El IR coordina y lidera el componente ambiental y geoespacial; la co-IR y Marlenne lideran el contenido de salud, cada una en su región; Cristian gestiona la red y la plataforma de seguimiento. Los estudiantes y tesistas se integran al estudio comparado bajo supervisión del IR y de la co-IR.</w:t>
+          </w:p>
+          <w:p>
+            <w:pPr>
+              <w:spacing w:line="240" w:lineRule="auto" w:after="60"/>
+            </w:pPr>
+            <w:r>
+              <w:rPr>
+                <w:rFonts w:ascii="Verdana" w:hAnsi="Verdana" w:cs="Verdana" w:eastAsia="Verdana"/>
+                <w:b w:val="0"/>
+                <w:sz w:val="20"/>
+              </w:rPr>
+              <w:t>Articulación. El IR coordina y lidera el componente ambiental y geoespacial y la gestión de la red y de su plataforma de seguimiento; la co-IR lidera el contenido de salud. Los estudiantes y tesistas se integran al estudio comparado bajo supervisión del IR y de la co-IR.</w:t>
             </w:r>
           </w:p>
         </w:tc>
@@ -14381,7 +14325,7 @@
                 <w:b w:val="0"/>
                 <w:sz w:val="20"/>
               </w:rPr>
-              <w:t>1. Red formalizada: acuerdo de colaboración y plan de trabajo 2027 firmados por las seis instituciones, con reuniones de coordinación mensuales (mes 3).</w:t>
+              <w:t>1. Red formalizada: acuerdo de colaboración y plan de trabajo 2027 firmados por las cinco instituciones, con reuniones de coordinación mensuales (mes 3).</w:t>
             </w:r>
           </w:p>
           <w:p>
@@ -14780,7 +14724,7 @@
                 <w:b w:val="0"/>
                 <w:sz w:val="20"/>
               </w:rPr>
-              <w:t>Esta propuesta transforma una colaboración basada en un proyecto no adjudicado en una red de seis instituciones con plan de trabajo, datos comunes y compromisos de continuidad. Se suma la UCM, lo que la vuelve interregional, y se incorporan dos instituciones de Brasil.</w:t>
+              <w:t>Esta propuesta transforma una colaboración basada en un proyecto no adjudicado en una red de cinco instituciones con plan de trabajo, datos comunes y compromisos de continuidad. Se incorporan dos instituciones de Brasil.</w:t>
             </w:r>
           </w:p>
           <w:p>
@@ -14995,7 +14939,7 @@
                 <w:b w:val="0"/>
                 <w:sz w:val="20"/>
               </w:rPr>
-              <w:t>Mecanismos. (1) Pasantías de cuatro integrantes del grupo chileno en Coimbra y Luanda, con fortalecimiento y estandarización de competencias en SIG aplicado a la salud. (2) Participación de estudiantes y tesistas de pregrado y postgrado de USACH y de la UCM en el estudio comparado, bajo supervisión del IR y la co-IR, con la posibilidad de desarrollar sus trabajos de titulación con datos del proyecto. (3) Tres seminarios virtuales y un taller presencial abiertos a estudiantes de las regiones participantes. (4) Co-autoría de estudiantes y tesistas en el policy brief y, cuando corresponda, en el artículo. (5) Vínculo con el proyecto Abdias Nascimento/CAPES (UNILAB), que facilita la movilidad de estudiantes de postgrado de Brasil hacia USACH.</w:t>
+              <w:t>Mecanismos. (1) Pasantías de cuatro integrantes del grupo chileno en Coimbra y Luanda, con fortalecimiento y estandarización de competencias en SIG aplicado a la salud. (2) Participación de estudiantes y tesistas de pregrado y postgrado de USACH en el estudio comparado, bajo supervisión del IR y la co-IR, con la posibilidad de desarrollar sus trabajos de titulación con datos del proyecto. (3) Tres seminarios virtuales y un taller presencial abiertos a estudiantes de las regiones participantes. (4) Co-autoría de estudiantes y tesistas en el policy brief y, cuando corresponda, en el artículo. (5) Vínculo con el proyecto Abdias Nascimento/CAPES (UNILAB), que facilita la movilidad de estudiantes de postgrado de Brasil hacia USACH.</w:t>
             </w:r>
             <w:commentRangeEnd w:id="14"/>
             <w:r>
@@ -15035,7 +14979,7 @@
                 <w:b w:val="0"/>
                 <w:sz w:val="20"/>
               </w:rPr>
-              <w:t>estudiantes y tesistas incorporados al estudio; mujeres en al menos 50% de las actividades formativas. La capacidad de análisis territorial queda instalada en el equipo de USACH y de la UCM y se transmite a nuevas generaciones a través de los trabajos de titulación y de los seminarios anuales. Estos mecanismos no requieren honorarios, por lo que las bases de este concurso los permiten.</w:t>
+              <w:t>estudiantes y tesistas incorporados al estudio; mujeres en al menos 50% de las actividades formativas. La capacidad de análisis territorial queda instalada en el equipo de USACH y se transmite a nuevas generaciones a través de los trabajos de titulación y de los seminarios anuales. Estos mecanismos no requieren honorarios, por lo que las bases de este concurso los permiten.</w:t>
             </w:r>
           </w:p>
         </w:tc>

</xml_diff>